<commit_message>
Se actualiza la plantilla para utilizar la matricula MP
</commit_message>
<xml_diff>
--- a/templates/PlantillaInforme.docx
+++ b/templates/PlantillaInforme.docx
@@ -777,6 +777,22 @@
           <w:rtl w:val="0"/>
         </w:rPr>
         <w:t xml:space="preserve">Cardióloga Clínica</w:t>
+      </w:r>
+    </w:p>
+    <w:p>
+      <w:pPr>
+        <w:ind w:left="6480" w:right="-607.7952755905511" w:firstLine="0"/>
+        <w:jc w:val="center"/>
+        <w:rPr>
+          <w:b w:val="1"/>
+        </w:rPr>
+      </w:pPr>
+      <w:r>
+        <w:rPr>
+          <w:b w:val="1"/>
+          <w:rtl w:val="0"/>
+        </w:rPr>
+        <w:t xml:space="preserve">MP235697</w:t>
       </w:r>
     </w:p>
     <w:sectPr>
@@ -819,7 +835,7 @@
         <wp:inline distB="114300" distT="114300" distL="114300" distR="114300">
           <wp:extent cx="2062163" cy="784444"/>
           <wp:effectExtent b="0" l="0" r="0" t="0"/>
-          <wp:docPr id="2" name="image1.png"/>
+          <wp:docPr id="3" name="image1.png"/>
           <a:graphic>
             <a:graphicData uri="http://schemas.openxmlformats.org/drawingml/2006/picture">
               <pic:pic>
@@ -1241,6 +1257,142 @@
     <w:rPr>
       <w:sz w:val="52"/>
       <w:szCs w:val="52"/>
+    </w:rPr>
+  </w:style>
+  <w:style w:type="paragraph" w:styleId="Normal" w:default="1">
+    <w:name w:val="normal"/>
+  </w:style>
+  <w:style w:type="table" w:styleId="TableNormal" w:default="1">
+    <w:name w:val="Table Normal"/>
+  </w:style>
+  <w:style w:type="paragraph" w:styleId="Heading1">
+    <w:name w:val="heading 1"/>
+    <w:basedOn w:val="Normal"/>
+    <w:next w:val="Normal"/>
+    <w:pPr>
+      <w:keepNext w:val="1"/>
+      <w:keepLines w:val="1"/>
+      <w:pageBreakBefore w:val="0"/>
+      <w:spacing w:after="120" w:before="400" w:lineRule="auto"/>
+    </w:pPr>
+    <w:rPr>
+      <w:sz w:val="40"/>
+      <w:szCs w:val="40"/>
+    </w:rPr>
+  </w:style>
+  <w:style w:type="paragraph" w:styleId="Heading2">
+    <w:name w:val="heading 2"/>
+    <w:basedOn w:val="Normal"/>
+    <w:next w:val="Normal"/>
+    <w:pPr>
+      <w:keepNext w:val="1"/>
+      <w:keepLines w:val="1"/>
+      <w:pageBreakBefore w:val="0"/>
+      <w:spacing w:after="120" w:before="360" w:lineRule="auto"/>
+    </w:pPr>
+    <w:rPr>
+      <w:b w:val="0"/>
+      <w:sz w:val="32"/>
+      <w:szCs w:val="32"/>
+    </w:rPr>
+  </w:style>
+  <w:style w:type="paragraph" w:styleId="Heading3">
+    <w:name w:val="heading 3"/>
+    <w:basedOn w:val="Normal"/>
+    <w:next w:val="Normal"/>
+    <w:pPr>
+      <w:keepNext w:val="1"/>
+      <w:keepLines w:val="1"/>
+      <w:pageBreakBefore w:val="0"/>
+      <w:spacing w:after="80" w:before="320" w:lineRule="auto"/>
+    </w:pPr>
+    <w:rPr>
+      <w:b w:val="0"/>
+      <w:color w:val="434343"/>
+      <w:sz w:val="28"/>
+      <w:szCs w:val="28"/>
+    </w:rPr>
+  </w:style>
+  <w:style w:type="paragraph" w:styleId="Heading4">
+    <w:name w:val="heading 4"/>
+    <w:basedOn w:val="Normal"/>
+    <w:next w:val="Normal"/>
+    <w:pPr>
+      <w:keepNext w:val="1"/>
+      <w:keepLines w:val="1"/>
+      <w:pageBreakBefore w:val="0"/>
+      <w:spacing w:after="80" w:before="280" w:lineRule="auto"/>
+    </w:pPr>
+    <w:rPr>
+      <w:color w:val="666666"/>
+      <w:sz w:val="24"/>
+      <w:szCs w:val="24"/>
+    </w:rPr>
+  </w:style>
+  <w:style w:type="paragraph" w:styleId="Heading5">
+    <w:name w:val="heading 5"/>
+    <w:basedOn w:val="Normal"/>
+    <w:next w:val="Normal"/>
+    <w:pPr>
+      <w:keepNext w:val="1"/>
+      <w:keepLines w:val="1"/>
+      <w:pageBreakBefore w:val="0"/>
+      <w:spacing w:after="80" w:before="240" w:lineRule="auto"/>
+    </w:pPr>
+    <w:rPr>
+      <w:color w:val="666666"/>
+      <w:sz w:val="22"/>
+      <w:szCs w:val="22"/>
+    </w:rPr>
+  </w:style>
+  <w:style w:type="paragraph" w:styleId="Heading6">
+    <w:name w:val="heading 6"/>
+    <w:basedOn w:val="Normal"/>
+    <w:next w:val="Normal"/>
+    <w:pPr>
+      <w:keepNext w:val="1"/>
+      <w:keepLines w:val="1"/>
+      <w:pageBreakBefore w:val="0"/>
+      <w:spacing w:after="80" w:before="240" w:lineRule="auto"/>
+    </w:pPr>
+    <w:rPr>
+      <w:i w:val="1"/>
+      <w:color w:val="666666"/>
+      <w:sz w:val="22"/>
+      <w:szCs w:val="22"/>
+    </w:rPr>
+  </w:style>
+  <w:style w:type="paragraph" w:styleId="Title">
+    <w:name w:val="Title"/>
+    <w:basedOn w:val="Normal"/>
+    <w:next w:val="Normal"/>
+    <w:pPr>
+      <w:keepNext w:val="1"/>
+      <w:keepLines w:val="1"/>
+      <w:pageBreakBefore w:val="0"/>
+      <w:spacing w:after="60" w:before="0" w:lineRule="auto"/>
+    </w:pPr>
+    <w:rPr>
+      <w:sz w:val="52"/>
+      <w:szCs w:val="52"/>
+    </w:rPr>
+  </w:style>
+  <w:style w:type="paragraph" w:styleId="Subtitle">
+    <w:name w:val="Subtitle"/>
+    <w:basedOn w:val="Normal"/>
+    <w:next w:val="Normal"/>
+    <w:pPr>
+      <w:keepNext w:val="1"/>
+      <w:keepLines w:val="1"/>
+      <w:pageBreakBefore w:val="0"/>
+      <w:spacing w:after="320" w:before="0" w:lineRule="auto"/>
+    </w:pPr>
+    <w:rPr>
+      <w:rFonts w:ascii="Arial" w:cs="Arial" w:eastAsia="Arial" w:hAnsi="Arial"/>
+      <w:i w:val="0"/>
+      <w:color w:val="666666"/>
+      <w:sz w:val="30"/>
+      <w:szCs w:val="30"/>
     </w:rPr>
   </w:style>
   <w:style w:type="paragraph" w:styleId="Subtitle">
@@ -1604,7 +1756,7 @@
 
 <file path=customXML/item1.xml><?xml version="1.0" encoding="utf-8"?>
 <go:gDocsCustomXmlDataStorage xmlns:go="http://customooxmlschemas.google.com/" xmlns:r="http://schemas.openxmlformats.org/officeDocument/2006/relationships" uri="GoogleDocsCustomDataVersion2">
-  <go:docsCustomData xmlns:go="http://customooxmlschemas.google.com/" roundtripDataSignature="AMtx7mh79rxoVPvxdaoPXSQVGEl8mL8aWw==">CgMxLjAyCGguZ2pkZ3hzMgloLjMwajB6bGw4AHIhMU5pZHZVTVRqVC1nbGdiRlNma04zaDNIblowN1dkRlNi</go:docsCustomData>
+  <go:docsCustomData xmlns:go="http://customooxmlschemas.google.com/" roundtripDataSignature="AMtx7mh43hWrxwpj0zFf+LjK0kZ7b9eoqA==">CgMxLjAyCGguZ2pkZ3hzMgloLjMwajB6bGw4AHIhMXBSWERrWTd6Vjk0a3pIVERVaG5UbVpGdWxqeVZvV2kw</go:docsCustomData>
 </go:gDocsCustomXmlDataStorage>
 </file>
 

</xml_diff>

<commit_message>
Se agrega firma digital al template
</commit_message>
<xml_diff>
--- a/templates/PlantillaInforme.docx
+++ b/templates/PlantillaInforme.docx
@@ -670,6 +670,48 @@
         </w:rPr>
         <w:t xml:space="preserve"> </w:t>
       </w:r>
+      <w:r>
+        <w:drawing>
+          <wp:anchor allowOverlap="1" behindDoc="1" distB="114300" distT="114300" distL="114300" distR="114300" hidden="0" layoutInCell="1" locked="0" relativeHeight="0" simplePos="0">
+            <wp:simplePos x="0" y="0"/>
+            <wp:positionH relativeFrom="column">
+              <wp:posOffset>4286250</wp:posOffset>
+            </wp:positionH>
+            <wp:positionV relativeFrom="paragraph">
+              <wp:posOffset>222838</wp:posOffset>
+            </wp:positionV>
+            <wp:extent cx="1676229" cy="925192"/>
+            <wp:effectExtent b="0" l="0" r="0" t="0"/>
+            <wp:wrapNone/>
+            <wp:docPr id="3" name="image3.png"/>
+            <a:graphic>
+              <a:graphicData uri="http://schemas.openxmlformats.org/drawingml/2006/picture">
+                <pic:pic>
+                  <pic:nvPicPr>
+                    <pic:cNvPr id="0" name="image3.png"/>
+                    <pic:cNvPicPr preferRelativeResize="0"/>
+                  </pic:nvPicPr>
+                  <pic:blipFill>
+                    <a:blip r:embed="rId7"/>
+                    <a:srcRect b="0" l="0" r="0" t="0"/>
+                    <a:stretch>
+                      <a:fillRect/>
+                    </a:stretch>
+                  </pic:blipFill>
+                  <pic:spPr>
+                    <a:xfrm>
+                      <a:off x="0" y="0"/>
+                      <a:ext cx="1676229" cy="925192"/>
+                    </a:xfrm>
+                    <a:prstGeom prst="rect"/>
+                    <a:ln/>
+                  </pic:spPr>
+                </pic:pic>
+              </a:graphicData>
+            </a:graphic>
+          </wp:anchor>
+        </w:drawing>
+      </w:r>
     </w:p>
     <w:p>
       <w:pPr>
@@ -714,37 +756,37 @@
       </w:pPr>
       <w:r>
         <w:rPr>
-          <w:rtl w:val="0"/>
-        </w:rPr>
-      </w:r>
-    </w:p>
-    <w:p>
-      <w:pPr>
-        <w:ind w:left="0" w:firstLine="0"/>
-        <w:rPr>
-          <w:b w:val="1"/>
-        </w:rPr>
-      </w:pPr>
-      <w:r>
-        <w:rPr>
-          <w:rtl w:val="0"/>
-        </w:rPr>
-      </w:r>
-    </w:p>
-    <w:p>
-      <w:pPr>
-        <w:ind w:left="6480" w:right="-607.7952755905511" w:firstLine="0"/>
-        <w:rPr>
-          <w:b w:val="1"/>
-        </w:rPr>
-      </w:pPr>
-      <w:r>
-        <w:rPr>
-          <w:b w:val="1"/>
-          <w:rtl w:val="0"/>
-        </w:rPr>
-        <w:t xml:space="preserve">       ………………………...</w:t>
+          <w:b w:val="1"/>
+          <w:rtl w:val="0"/>
+        </w:rPr>
+        <w:t xml:space="preserve">     </w:t>
         <w:tab/>
+      </w:r>
+    </w:p>
+    <w:p>
+      <w:pPr>
+        <w:ind w:left="0" w:firstLine="0"/>
+        <w:rPr>
+          <w:b w:val="1"/>
+        </w:rPr>
+      </w:pPr>
+      <w:r>
+        <w:rPr>
+          <w:rtl w:val="0"/>
+        </w:rPr>
+      </w:r>
+    </w:p>
+    <w:p>
+      <w:pPr>
+        <w:ind w:left="0" w:firstLine="0"/>
+        <w:rPr>
+          <w:b w:val="1"/>
+        </w:rPr>
+      </w:pPr>
+      <w:r>
+        <w:rPr>
+          <w:rtl w:val="0"/>
+        </w:rPr>
       </w:r>
     </w:p>
     <w:p>
@@ -796,9 +838,9 @@
       </w:r>
     </w:p>
     <w:sectPr>
-      <w:headerReference r:id="rId7" w:type="default"/>
-      <w:headerReference r:id="rId8" w:type="first"/>
-      <w:footerReference r:id="rId9" w:type="first"/>
+      <w:headerReference r:id="rId8" w:type="default"/>
+      <w:headerReference r:id="rId9" w:type="first"/>
+      <w:footerReference r:id="rId10" w:type="first"/>
       <w:pgSz w:h="16834" w:w="11909" w:orient="portrait"/>
       <w:pgMar w:bottom="1440" w:top="1440" w:left="1440" w:right="1440" w:header="720" w:footer="720"/>
       <w:pgNumType w:start="1"/>
@@ -835,7 +877,7 @@
         <wp:inline distB="114300" distT="114300" distL="114300" distR="114300">
           <wp:extent cx="2062163" cy="784444"/>
           <wp:effectExtent b="0" l="0" r="0" t="0"/>
-          <wp:docPr id="3" name="image1.png"/>
+          <wp:docPr id="4" name="image1.png"/>
           <a:graphic>
             <a:graphicData uri="http://schemas.openxmlformats.org/drawingml/2006/picture">
               <pic:pic>

</xml_diff>

<commit_message>
se modifica diseño de template ubicacion de firma
</commit_message>
<xml_diff>
--- a/templates/PlantillaInforme.docx
+++ b/templates/PlantillaInforme.docx
@@ -670,17 +670,67 @@
         </w:rPr>
         <w:t xml:space="preserve"> </w:t>
       </w:r>
+    </w:p>
+    <w:p>
+      <w:pPr>
+        <w:ind w:left="0" w:firstLine="0"/>
+        <w:rPr>
+          <w:b w:val="1"/>
+        </w:rPr>
+      </w:pPr>
+      <w:r>
+        <w:rPr>
+          <w:color w:val="333333"/>
+          <w:shd w:fill="f9f9f9" w:val="clear"/>
+          <w:rtl w:val="0"/>
+        </w:rPr>
+        <w:t xml:space="preserve">{PRESION_PULSO_C}</w:t>
+      </w:r>
+      <w:r>
+        <w:rPr>
+          <w:rtl w:val="0"/>
+        </w:rPr>
+      </w:r>
+    </w:p>
+    <w:p>
+      <w:pPr>
+        <w:ind w:left="0" w:firstLine="0"/>
+        <w:rPr>
+          <w:b w:val="1"/>
+        </w:rPr>
+      </w:pPr>
+      <w:r>
+        <w:rPr>
+          <w:rtl w:val="0"/>
+        </w:rPr>
+      </w:r>
+    </w:p>
+    <w:p>
+      <w:pPr>
+        <w:ind w:left="0" w:firstLine="0"/>
+        <w:rPr>
+          <w:b w:val="1"/>
+        </w:rPr>
+      </w:pPr>
+      <w:r>
+        <w:rPr>
+          <w:b w:val="1"/>
+          <w:rtl w:val="0"/>
+        </w:rPr>
+        <w:t xml:space="preserve">     </w:t>
+        <w:tab/>
+      </w:r>
       <w:r>
         <w:drawing>
           <wp:anchor allowOverlap="1" behindDoc="1" distB="114300" distT="114300" distL="114300" distR="114300" hidden="0" layoutInCell="1" locked="0" relativeHeight="0" simplePos="0">
             <wp:simplePos x="0" y="0"/>
             <wp:positionH relativeFrom="column">
-              <wp:posOffset>4286250</wp:posOffset>
+              <wp:posOffset>4219575</wp:posOffset>
             </wp:positionH>
             <wp:positionV relativeFrom="paragraph">
-              <wp:posOffset>222838</wp:posOffset>
+              <wp:posOffset>125825</wp:posOffset>
             </wp:positionV>
-            <wp:extent cx="1676229" cy="925192"/>
+            <wp:extent cx="1910197" cy="1052779"/>
             <wp:effectExtent b="0" l="0" r="0" t="0"/>
             <wp:wrapNone/>
             <wp:docPr id="3" name="image3.png"/>
@@ -701,7 +751,7 @@
                   <pic:spPr>
                     <a:xfrm>
                       <a:off x="0" y="0"/>
-                      <a:ext cx="1676229" cy="925192"/>
+                      <a:ext cx="1910197" cy="1052779"/>
                     </a:xfrm>
                     <a:prstGeom prst="rect"/>
                     <a:ln/>
@@ -711,56 +761,6 @@
             </a:graphic>
           </wp:anchor>
         </w:drawing>
-      </w:r>
-    </w:p>
-    <w:p>
-      <w:pPr>
-        <w:ind w:left="0" w:firstLine="0"/>
-        <w:rPr>
-          <w:b w:val="1"/>
-        </w:rPr>
-      </w:pPr>
-      <w:r>
-        <w:rPr>
-          <w:color w:val="333333"/>
-          <w:shd w:fill="f9f9f9" w:val="clear"/>
-          <w:rtl w:val="0"/>
-        </w:rPr>
-        <w:t xml:space="preserve">{PRESION_PULSO_C}</w:t>
-      </w:r>
-      <w:r>
-        <w:rPr>
-          <w:rtl w:val="0"/>
-        </w:rPr>
-      </w:r>
-    </w:p>
-    <w:p>
-      <w:pPr>
-        <w:ind w:left="0" w:firstLine="0"/>
-        <w:rPr>
-          <w:b w:val="1"/>
-        </w:rPr>
-      </w:pPr>
-      <w:r>
-        <w:rPr>
-          <w:rtl w:val="0"/>
-        </w:rPr>
-      </w:r>
-    </w:p>
-    <w:p>
-      <w:pPr>
-        <w:ind w:left="0" w:firstLine="0"/>
-        <w:rPr>
-          <w:b w:val="1"/>
-        </w:rPr>
-      </w:pPr>
-      <w:r>
-        <w:rPr>
-          <w:b w:val="1"/>
-          <w:rtl w:val="0"/>
-        </w:rPr>
-        <w:t xml:space="preserve">     </w:t>
-        <w:tab/>
       </w:r>
     </w:p>
     <w:p>

</xml_diff>